<commit_message>
feat(import-dao): valeur de texte reprise dans le texte d'origine (§B6.3 : m³, ’, —, « » conserves ; carte par grapheme, reprojection apres les conflits, types convertis exclus) ; ponctuation de tete retiree d'une valeur (« : » de B02-LT-04) ; CCAP-T : l'annexe « Liste des Plans » recoit B04-CD-03 sous condition (decalque 573/573) ; demande D4 §B6 : contre-recettes B6.1 (AE-T « jusqu'au 17/09/2026 ») et B6.2 (import 53 s -> 2,3 s a l'ecran)
Co-Authored-By: Claude Opus 5.5 (1M context) <noreply@anthropic.com>
</commit_message>
<xml_diff>
--- a/docs/modeles-dao/CCAP-T.docx
+++ b/docs/modeles-dao/CCAP-T.docx
@@ -8595,6 +8595,45 @@
         <w:t>Liste des Plans</w:t>
       </w:r>
     </w:p>
+    <w:p>
+      <w:pPr>
+        <w:spacing w:after="120"/>
+        <w:jc w:val="both"/>
+      </w:pPr>
+      <w:r>
+        <w:rPr>
+          <w:b w:val="off"/>
+          <w:sz w:val="22"/>
+        </w:rPr>
+        <w:t>{{SI:PLANS}}</w:t>
+      </w:r>
+    </w:p>
+    <w:p>
+      <w:pPr>
+        <w:spacing w:after="120"/>
+        <w:jc w:val="both"/>
+      </w:pPr>
+      <w:r>
+        <w:rPr>
+          <w:b w:val="off"/>
+          <w:sz w:val="22"/>
+        </w:rPr>
+        <w:t>{{B04-CD-03}}</w:t>
+      </w:r>
+    </w:p>
+    <w:p>
+      <w:pPr>
+        <w:spacing w:after="120"/>
+        <w:jc w:val="both"/>
+      </w:pPr>
+      <w:r>
+        <w:rPr>
+          <w:b w:val="off"/>
+          <w:sz w:val="22"/>
+        </w:rPr>
+        <w:t>{{FINSI:PLANS}}</w:t>
+      </w:r>
+    </w:p>
   </w:body>
 </w:document>
 </file>
</xml_diff>

<commit_message>
fix(dao): recette du DAO du MEN (fiche 40) — liberation a la reception provisoire, trous du CCAP-T, critere de chiffre d'affaires conditionnel ; demande backend du 02/10
- CCAP-T 7.1 : « contient 100 » imprimait « reception definitive » pour une liberation a la provisoire ;
  chaque redaction suit son option entiere (LIBERATION-PROVISOIRE en ajout)
- CCAP-T : Annexe <numero>, « en date <a preciser> », seconde liste de seuils de force majeure retires ;
  art. 21 en B09-DL-01.parLot
- DPAO-T 6.3 a) sous CHIFFRE-AFFAIRES (B03-QT-07 renseigne)
- decrire.mjs : garde-fou du sort « adapte » repare (classe \p{L}\p{N} privee de ses barres obliques)
- fidelite DPAO-T 262/262, CCAP-T 572/572 ; banc 13 passes : Q10 tenu, 0 deduction fausse
- fiche des faits §10.1 : les cinq valeurs imposees par la fiche a la recette
- demande backend : modeles a recopier, obligatoires et libelles, champs et suffixes manquants, « ¿ » des donnees

Co-Authored-By: Claude Opus 5.5 (1M context) <noreply@anthropic.com>
</commit_message>
<xml_diff>
--- a/docs/modeles-dao/CCAP-T.docx
+++ b/docs/modeles-dao/CCAP-T.docx
@@ -1130,7 +1130,7 @@
           <w:b w:val="off"/>
           <w:sz w:val="22"/>
         </w:rPr>
-        <w:t>La maîtrise d'œuvre est assurée conformément au marché {{B02-MW-02}} en date &lt;à préciser&gt; par :</w:t>
+        <w:t>La maîtrise d'œuvre est assurée conformément au marché {{B02-MW-02}} par :</w:t>
       </w:r>
     </w:p>
     <w:p>
@@ -1832,7 +1832,7 @@
           <w:b w:val="off"/>
           <w:sz w:val="22"/>
         </w:rPr>
-        <w:t>- soit de garantie bancaire conformément au modèle figurant en Annexe &lt;numéro&gt; au présent CCAP;</w:t>
+        <w:t>- soit de garantie bancaire conformément au modèle figurant en Annexe au présent CCAP;</w:t>
       </w:r>
     </w:p>
     <w:p>
@@ -1871,7 +1871,7 @@
           <w:b w:val="off"/>
           <w:sz w:val="22"/>
         </w:rPr>
-        <w:t>- soit une caution personnelle et solidaire conformément au modèle figurant en Annexe &lt;numéro&gt; au présent CCAP;</w:t>
+        <w:t>- soit une caution personnelle et solidaire conformément au modèle figurant en Annexe au présent CCAP;</w:t>
       </w:r>
     </w:p>
     <w:p>
@@ -2002,6 +2002,45 @@
           <w:sz w:val="22"/>
         </w:rPr>
         <w:t>{{FINSI:LIBERATION-TOTALE}}</w:t>
+      </w:r>
+    </w:p>
+    <w:p>
+      <w:pPr>
+        <w:spacing w:after="120"/>
+        <w:jc w:val="both"/>
+      </w:pPr>
+      <w:r>
+        <w:rPr>
+          <w:b w:val="off"/>
+          <w:sz w:val="22"/>
+        </w:rPr>
+        <w:t>{{SI:LIBERATION-PROVISOIRE}}</w:t>
+      </w:r>
+    </w:p>
+    <w:p>
+      <w:pPr>
+        <w:spacing w:after="120"/>
+        <w:jc w:val="both"/>
+      </w:pPr>
+      <w:r>
+        <w:rPr>
+          <w:b w:val="off"/>
+          <w:sz w:val="22"/>
+        </w:rPr>
+        <w:t>La garantie de bonne exécution est libérée à 100% dans les 30 jours suivant la date de la réception provisoire</w:t>
+      </w:r>
+    </w:p>
+    <w:p>
+      <w:pPr>
+        <w:spacing w:after="120"/>
+        <w:jc w:val="both"/>
+      </w:pPr>
+      <w:r>
+        <w:rPr>
+          <w:b w:val="off"/>
+          <w:sz w:val="22"/>
+        </w:rPr>
+        <w:t>{{FINSI:LIBERATION-PROVISOIRE}}</w:t>
       </w:r>
     </w:p>
     <w:p>
@@ -4211,58 +4250,6 @@
           <w:b w:val="off"/>
           <w:sz w:val="22"/>
         </w:rPr>
-        <w:t>En vue de l’application éventuelle du deuxième des articles 18.1 et 19.2 du CCAG, le délai d’exécution des travaux sera prolongé d’un nombre de jours égal à celui pendant lequel un au moins des phénomènes naturels ci-après dépassera les intensités et durées limitées ci-après:</w:t>
-      </w:r>
-    </w:p>
-    <w:p>
-      <w:pPr>
-        <w:spacing w:after="120"/>
-        <w:jc w:val="both"/>
-      </w:pPr>
-      <w:r>
-        <w:rPr>
-          <w:b w:val="off"/>
-          <w:sz w:val="22"/>
-        </w:rPr>
-        <w:t>précipitations journalières supérieures ou égales à &lt;préciser le niveau&gt;</w:t>
-      </w:r>
-    </w:p>
-    <w:p>
-      <w:pPr>
-        <w:spacing w:after="120"/>
-        <w:jc w:val="both"/>
-      </w:pPr>
-      <w:r>
-        <w:rPr>
-          <w:b w:val="off"/>
-          <w:sz w:val="22"/>
-        </w:rPr>
-        <w:t>force du vent supérieure à &lt;préciser le niveau&gt;</w:t>
-      </w:r>
-    </w:p>
-    <w:p>
-      <w:pPr>
-        <w:spacing w:after="120"/>
-        <w:jc w:val="both"/>
-      </w:pPr>
-      <w:r>
-        <w:rPr>
-          <w:b w:val="off"/>
-          <w:sz w:val="22"/>
-        </w:rPr>
-        <w:t>Phénomènes constatés à &lt;préciser le lieu d’observation de ces phénomènes&gt;</w:t>
-      </w:r>
-    </w:p>
-    <w:p>
-      <w:pPr>
-        <w:spacing w:after="120"/>
-        <w:jc w:val="both"/>
-      </w:pPr>
-      <w:r>
-        <w:rPr>
-          <w:b w:val="off"/>
-          <w:sz w:val="22"/>
-        </w:rPr>
         <w:t>{{FINSI:FORCE-MAJEURE-OUI}}</w:t>
       </w:r>
     </w:p>
@@ -4328,7 +4315,7 @@
           <w:b w:val="off"/>
           <w:sz w:val="22"/>
         </w:rPr>
-        <w:t>Le délai d'exécution est fixé à {{B09-DL-01}} à compter du lendemain de la date de notification de l’ordre de service de commencer les travaux qui interviendra après la notification à l’Entrepreneur du marché approuvé</w:t>
+        <w:t>Le délai d'exécution est fixé à {{B09-DL-01.parLot}} à compter du lendemain de la date de notification de l’ordre de service de commencer les travaux qui interviendra après la notification à l’Entrepreneur du marché approuvé</w:t>
       </w:r>
     </w:p>
     <w:p>

</xml_diff>

<commit_message>
feat(modeles): garanties de soumission B1 / B2 recopiees du document type des travaux (renvois 6.7 / 10.4 travaux) ; CCAP-T sans maitre d'oeuvre sans trou ; contre-recette du referentiel des travaux (fiche 31)
Co-Authored-By: Claude Opus 5.5 (1M context) <noreply@anthropic.com>
</commit_message>
<xml_diff>
--- a/docs/modeles-dao/CCAP-T.docx
+++ b/docs/modeles-dao/CCAP-T.docx
@@ -1182,20 +1182,7 @@
           <w:b w:val="off"/>
           <w:sz w:val="22"/>
         </w:rPr>
-        <w:t>Les tâches du maître d'œuvre sont assurées par &lt;préciser l'autorité désignée par la PRMP&gt;</w:t>
-      </w:r>
-    </w:p>
-    <w:p>
-      <w:pPr>
-        <w:spacing w:after="120"/>
-        <w:jc w:val="both"/>
-      </w:pPr>
-      <w:r>
-        <w:rPr>
-          <w:b w:val="off"/>
-          <w:sz w:val="22"/>
-        </w:rPr>
-        <w:t>Dans ce cas, le maître d’œuvre sera désigné par une décision du Maître de l’ouvrage ou de la PRMP</w:t>
+        <w:t>Le maître d’œuvre sera désigné par une décision du Maître de l’ouvrage ou de la PRMP</w:t>
       </w:r>
     </w:p>
     <w:p>

</xml_diff>